<commit_message>
D-03·D-07·D-08 결정 반영: 하이브리드 GPU 운용 계획 + piper TTS + STT medium
- docs/gpu-hybrid-plan.md 신설: 홈 서버 구매 가이드(4090/4070TiS), 클라우드 스팟 학습 절차, 데이터 주권 원칙(건강 그래프는 업로드 금지)
- voice_client: TTS 우선순위 piper→espeak-ng→텍스트, STT 기본 medium
- .env.example: STT_BASE_URL/STT_MODEL/PIPER_MODEL 추가
- 결정 로그: D-03·D-07·D-08 확정 처리

Co-Authored-By: Claude Fable 5 <noreply@anthropic.com>
Claude-Session: https://claude.ai/code/session_01DHw7x39sLy4eZNUKoqjdfx
</commit_message>
<xml_diff>
--- a/book/draft-v2/결정대기_에러_로그.docx
+++ b/book/draft-v2/결정대기_에러_로그.docx
@@ -320,7 +320,7 @@
                 <w:rFonts w:ascii="맑은 고딕" w:hAnsi="맑은 고딕" w:eastAsia="맑은 고딕"/>
                 <w:sz w:val="19"/>
               </w:rPr>
-              <w:t>GPU 서버 확보</w:t>
+              <w:t>~~GPU 서버 확보~~ ✅ 확정: 하이브리드</w:t>
             </w:r>
           </w:p>
         </w:tc>
@@ -334,7 +334,7 @@
                 <w:rFonts w:ascii="맑은 고딕" w:hAnsi="맑은 고딕" w:eastAsia="맑은 고딕"/>
                 <w:sz w:val="19"/>
               </w:rPr>
-              <w:t>WBS 2차(T21~T25) 착수 전제. 자체 구매 vs 클라우드(시간당 과금) 중 선택 필요.</w:t>
+              <w:t>집에 GPU PC(상시 추론·비서) + 학습만 클라우드 스팟. 구매 가이드·운용 원칙: `physical-brain/docs/gpu-hybrid-plan.md`</w:t>
             </w:r>
           </w:p>
         </w:tc>
@@ -348,7 +348,7 @@
                 <w:rFonts w:ascii="맑은 고딕" w:hAnsi="맑은 고딕" w:eastAsia="맑은 고딕"/>
                 <w:sz w:val="19"/>
               </w:rPr>
-              <w:t>자체 구매 / 클라우드 / 보류</w:t>
+              <w:t>하이브리드 확정</w:t>
             </w:r>
           </w:p>
         </w:tc>
@@ -362,7 +362,7 @@
                 <w:rFonts w:ascii="맑은 고딕" w:hAnsi="맑은 고딕" w:eastAsia="맑은 고딕"/>
                 <w:sz w:val="19"/>
               </w:rPr>
-              <w:t>T20 완료 전</w:t>
+              <w:t>완료</w:t>
             </w:r>
           </w:p>
         </w:tc>
@@ -608,7 +608,7 @@
                 <w:rFonts w:ascii="맑은 고딕" w:hAnsi="맑은 고딕" w:eastAsia="맑은 고딕"/>
                 <w:sz w:val="19"/>
               </w:rPr>
-              <w:t>한국어 TTS 엔진 선택</w:t>
+              <w:t>~~한국어 TTS 엔진~~ ✅ 확정: piper</w:t>
             </w:r>
           </w:p>
         </w:tc>
@@ -622,7 +622,7 @@
                 <w:rFonts w:ascii="맑은 고딕" w:hAnsi="맑은 고딕" w:eastAsia="맑은 고딕"/>
                 <w:sz w:val="19"/>
               </w:rPr>
-              <w:t>음성 클라이언트(T23)의 목소리. espeak-ng(즉시·기계음) vs piper(자연스러움·모델 다운로드 필요). 기본은 espeak-ng, 런북 부록에 piper 전환법 수록.</w:t>
+              <w:t>코드 반영 완료 — `.env PIPER_MODEL` 경로만 지정하면 자동 사용, 없으면 espeak-ng 폴백.</w:t>
             </w:r>
           </w:p>
         </w:tc>
@@ -636,7 +636,7 @@
                 <w:rFonts w:ascii="맑은 고딕" w:hAnsi="맑은 고딕" w:eastAsia="맑은 고딕"/>
                 <w:sz w:val="19"/>
               </w:rPr>
-              <w:t>espeak-ng 유지 / piper 전환</w:t>
+              <w:t>piper 확정</w:t>
             </w:r>
           </w:p>
         </w:tc>
@@ -650,7 +650,7 @@
                 <w:rFonts w:ascii="맑은 고딕" w:hAnsi="맑은 고딕" w:eastAsia="맑은 고딕"/>
                 <w:sz w:val="19"/>
               </w:rPr>
-              <w:t>GPU 서버 가동 후</w:t>
+              <w:t>완료</w:t>
             </w:r>
           </w:p>
         </w:tc>
@@ -680,7 +680,7 @@
                 <w:rFonts w:ascii="맑은 고딕" w:hAnsi="맑은 고딕" w:eastAsia="맑은 고딕"/>
                 <w:sz w:val="19"/>
               </w:rPr>
-              <w:t>STT 모델 크기</w:t>
+              <w:t>~~STT 모델 크기~~ ✅ 확정: medium</w:t>
             </w:r>
           </w:p>
         </w:tc>
@@ -694,7 +694,7 @@
                 <w:rFonts w:ascii="맑은 고딕" w:hAnsi="맑은 고딕" w:eastAsia="맑은 고딕"/>
                 <w:sz w:val="19"/>
               </w:rPr>
-              <w:t>faster-whisper-server 기본 small(빠름·정확도 보통) vs medium(느림·정확도 상승). GPU 여유 있으면 medium 권장. `.env STT_MODEL`로 변경.</w:t>
+              <w:t>코드 반영 완료 — 기본값이 faster-whisper-medium으로 변경됨(어르신 발화 인식률 우선).</w:t>
             </w:r>
           </w:p>
         </w:tc>
@@ -708,7 +708,7 @@
                 <w:rFonts w:ascii="맑은 고딕" w:hAnsi="맑은 고딕" w:eastAsia="맑은 고딕"/>
                 <w:sz w:val="19"/>
               </w:rPr>
-              <w:t>small / medium</w:t>
+              <w:t>medium 확정</w:t>
             </w:r>
           </w:p>
         </w:tc>
@@ -722,7 +722,7 @@
                 <w:rFonts w:ascii="맑은 고딕" w:hAnsi="맑은 고딕" w:eastAsia="맑은 고딕"/>
                 <w:sz w:val="19"/>
               </w:rPr>
-              <w:t>GPU 서버 가동 후</w:t>
+              <w:t>완료</w:t>
             </w:r>
           </w:p>
         </w:tc>

</xml_diff>

<commit_message>
T43 온톨로지 v2 삼각 모델: Skill·Project 노드, LEARNS·WORKS_ON·CONTRIBUTES_TO 관계, 삼각 밸런스 대시보드
- schema: 노드 9종·관계 9종 (복수 규약 validate_edge), 하위 호환
- vault_sync: skill/project/activity 노트 + skills/projects 위키링크 → CONTRIBUTES_TO
- store.triangle_week(): 7일 영역 기여 + 교차기여율(일석삼조 지표)
- 홈 대시보드 '삼각 밸런스' 카드, make_vault v2 예시 노트 3종, docs/ontology-v2.md
- T42(Odoo 커넥터) 백로그 등록. 테스트 29/29

Co-Authored-By: Claude Fable 5 <noreply@anthropic.com>
Claude-Session: https://claude.ai/code/session_01DHw7x39sLy4eZNUKoqjdfx
</commit_message>
<xml_diff>
--- a/book/draft-v2/결정대기_에러_로그.docx
+++ b/book/draft-v2/결정대기_에러_로그.docx
@@ -729,6 +729,36 @@
       </w:tr>
     </w:tbl>
     <w:p/>
+    <w:p>
+      <w:r>
+        <w:rPr>
+          <w:rFonts w:ascii="맑은 고딕" w:hAnsi="맑은 고딕" w:eastAsia="맑은 고딕"/>
+          <w:b/>
+        </w:rPr>
+        <w:t>📌 2026-07-19 백로그 추가 — T42 Odoo 커넥터</w:t>
+      </w:r>
+      <w:r>
+        <w:rPr>
+          <w:rFonts w:ascii="맑은 고딕" w:hAnsi="맑은 고딕" w:eastAsia="맑은 고딕"/>
+        </w:rPr>
+        <w:t>: KG-DMAIC v2 기업편(E-DMAIC/O)의 실행 도구. `pipelines/odoo_sync.py`가 XML-RPC로 Odoo(res.partner·sale.order 등)를 읽어 GraphStore에 미러링(읽기 전용부터) → 개인 건강 그래프와 사업 그래프가 한 사서 아래 통합, 아침 브리핑에 납기·미수금 포함. 전제: 회원님 Odoo 인스턴스 가동(파트너 라이선스 보유). 착수: 요청 시.</w:t>
+      </w:r>
+    </w:p>
+    <w:p>
+      <w:r>
+        <w:rPr>
+          <w:rFonts w:ascii="맑은 고딕" w:hAnsi="맑은 고딕" w:eastAsia="맑은 고딕"/>
+          <w:b/>
+        </w:rPr>
+        <w:t>✅ 2026-07-19 완료 — T43 온톨로지 v2 삼각 모델 구현</w:t>
+      </w:r>
+      <w:r>
+        <w:rPr>
+          <w:rFonts w:ascii="맑은 고딕" w:hAnsi="맑은 고딕" w:eastAsia="맑은 고딕"/>
+        </w:rPr>
+        <w:t>: Skill·Project 노드 + LEARNS·WORKS_ON·CONTRIBUTES_TO 관계, 볼트 노트(type: skill/project/activity + skills/projects 링크) 동기화, 홈 대시보드 '삼각 밸런스' 카드(교차기여율), make_vault v2 템플릿 3종. 테스트 29/29 통과.</w:t>
+      </w:r>
+    </w:p>
     <w:p>
       <w:r>
         <w:rPr>

</xml_diff>